<commit_message>
docs: merge note update for assistant tour polish
</commit_message>
<xml_diff>
--- a/docs/Sprint 3/Merge note - Sprint 3 details-help  chatbot.docx
+++ b/docs/Sprint 3/Merge note - Sprint 3 details-help  chatbot.docx
@@ -15,7 +15,7 @@
         <w:spacing w:after="200"/>
       </w:pPr>
       <w:r>
-        <w:t xml:space="preserve">21 October 2026 · Dev 1, Minh Quang Tran</w:t>
+        <w:t xml:space="preserve">21 October 2026, updated 23 October · Dev 1, Minh Quang Tran</w:t>
       </w:r>
     </w:p>
     <w:p>
@@ -1058,6 +1058,936 @@
       <w:r>
         <w:t xml:space="preserve">.</w:t>
       </w:r>
+    </w:p>
+    <w:p>
+      <w:pPr>
+        <w:pStyle w:val="Heading1"/>
+        <w:pageBreakBefore/>
+      </w:pPr>
+      <w:r>
+        <w:t xml:space="preserve">Update, 23 October: assistant tour polish</w:t>
+      </w:r>
+    </w:p>
+    <w:tbl>
+      <w:tblPr>
+        <w:tblW w:type="dxa" w:w="9360"/>
+        <w:tblBorders>
+          <w:top w:val="single" w:color="auto" w:sz="4"/>
+          <w:left w:val="single" w:color="auto" w:sz="4"/>
+          <w:bottom w:val="single" w:color="auto" w:sz="4"/>
+          <w:right w:val="single" w:color="auto" w:sz="4"/>
+          <w:insideH w:val="single" w:color="auto" w:sz="4"/>
+          <w:insideV w:val="single" w:color="auto" w:sz="4"/>
+        </w:tblBorders>
+      </w:tblPr>
+      <w:tblGrid>
+        <w:gridCol w:w="2800"/>
+        <w:gridCol w:w="6560"/>
+      </w:tblGrid>
+      <w:tr>
+        <w:trPr>
+          <w:cantSplit/>
+          <w:tblHeader w:val="false"/>
+        </w:trPr>
+        <w:tc>
+          <w:tcPr>
+            <w:tcW w:type="dxa" w:w="2800"/>
+            <w:tcBorders>
+              <w:top w:val="single" w:color="BFC8D9" w:sz="4"/>
+              <w:left w:val="single" w:color="BFC8D9" w:sz="4"/>
+              <w:bottom w:val="single" w:color="BFC8D9" w:sz="4"/>
+              <w:right w:val="single" w:color="BFC8D9" w:sz="4"/>
+            </w:tcBorders>
+            <w:shd w:fill="E8F1F8" w:color="auto" w:val="clear"/>
+            <w:tcMar>
+              <w:top w:type="dxa" w:w="70"/>
+              <w:left w:type="dxa" w:w="110"/>
+              <w:bottom w:type="dxa" w:w="70"/>
+              <w:right w:type="dxa" w:w="110"/>
+            </w:tcMar>
+          </w:tcPr>
+          <w:p>
+            <w:pPr>
+              <w:spacing w:after="40"/>
+            </w:pPr>
+            <w:r>
+              <w:rPr>
+                <w:b/>
+                <w:bCs/>
+              </w:rPr>
+              <w:t xml:space="preserve">Into</w:t>
+            </w:r>
+          </w:p>
+        </w:tc>
+        <w:tc>
+          <w:tcPr>
+            <w:tcW w:type="dxa" w:w="6560"/>
+            <w:tcBorders>
+              <w:top w:val="single" w:color="BFC8D9" w:sz="4"/>
+              <w:left w:val="single" w:color="BFC8D9" w:sz="4"/>
+              <w:bottom w:val="single" w:color="BFC8D9" w:sz="4"/>
+              <w:right w:val="single" w:color="BFC8D9" w:sz="4"/>
+            </w:tcBorders>
+            <w:tcMar>
+              <w:top w:type="dxa" w:w="70"/>
+              <w:left w:type="dxa" w:w="110"/>
+              <w:bottom w:type="dxa" w:w="70"/>
+              <w:right w:type="dxa" w:w="110"/>
+            </w:tcMar>
+          </w:tcPr>
+          <w:p>
+            <w:pPr>
+              <w:spacing w:after="40"/>
+            </w:pPr>
+            <w:r>
+              <w:rPr>
+                <w:rFonts w:ascii="Consolas" w:cs="Consolas" w:eastAsia="Consolas" w:hAnsi="Consolas"/>
+                <w:color w:val="1F3864"/>
+                <w:sz w:val="19"/>
+                <w:szCs w:val="19"/>
+              </w:rPr>
+              <w:t xml:space="preserve">merge/sprint3-details-chatbot</w:t>
+            </w:r>
+          </w:p>
+        </w:tc>
+      </w:tr>
+      <w:tr>
+        <w:trPr>
+          <w:cantSplit/>
+          <w:tblHeader w:val="false"/>
+        </w:trPr>
+        <w:tc>
+          <w:tcPr>
+            <w:tcW w:type="dxa" w:w="2800"/>
+            <w:tcBorders>
+              <w:top w:val="single" w:color="BFC8D9" w:sz="4"/>
+              <w:left w:val="single" w:color="BFC8D9" w:sz="4"/>
+              <w:bottom w:val="single" w:color="BFC8D9" w:sz="4"/>
+              <w:right w:val="single" w:color="BFC8D9" w:sz="4"/>
+            </w:tcBorders>
+            <w:shd w:fill="E8F1F8" w:color="auto" w:val="clear"/>
+            <w:tcMar>
+              <w:top w:type="dxa" w:w="70"/>
+              <w:left w:type="dxa" w:w="110"/>
+              <w:bottom w:type="dxa" w:w="70"/>
+              <w:right w:type="dxa" w:w="110"/>
+            </w:tcMar>
+          </w:tcPr>
+          <w:p>
+            <w:pPr>
+              <w:spacing w:after="40"/>
+            </w:pPr>
+            <w:r>
+              <w:rPr>
+                <w:b/>
+                <w:bCs/>
+              </w:rPr>
+              <w:t xml:space="preserve">From</w:t>
+            </w:r>
+          </w:p>
+        </w:tc>
+        <w:tc>
+          <w:tcPr>
+            <w:tcW w:type="dxa" w:w="6560"/>
+            <w:tcBorders>
+              <w:top w:val="single" w:color="BFC8D9" w:sz="4"/>
+              <w:left w:val="single" w:color="BFC8D9" w:sz="4"/>
+              <w:bottom w:val="single" w:color="BFC8D9" w:sz="4"/>
+              <w:right w:val="single" w:color="BFC8D9" w:sz="4"/>
+            </w:tcBorders>
+            <w:tcMar>
+              <w:top w:type="dxa" w:w="70"/>
+              <w:left w:type="dxa" w:w="110"/>
+              <w:bottom w:type="dxa" w:w="70"/>
+              <w:right w:type="dxa" w:w="110"/>
+            </w:tcMar>
+          </w:tcPr>
+          <w:p>
+            <w:pPr>
+              <w:spacing w:after="40"/>
+            </w:pPr>
+            <w:r>
+              <w:rPr>
+                <w:rFonts w:ascii="Consolas" w:cs="Consolas" w:eastAsia="Consolas" w:hAnsi="Consolas"/>
+                <w:color w:val="1F3864"/>
+                <w:sz w:val="19"/>
+                <w:szCs w:val="19"/>
+              </w:rPr>
+              <w:t xml:space="preserve">feature/sprint3-assistant-tour-polish</w:t>
+            </w:r>
+            <w:r>
+              <w:t xml:space="preserve"> (Nihal, 4 commits)</w:t>
+            </w:r>
+          </w:p>
+        </w:tc>
+      </w:tr>
+      <w:tr>
+        <w:trPr>
+          <w:cantSplit/>
+          <w:tblHeader w:val="false"/>
+        </w:trPr>
+        <w:tc>
+          <w:tcPr>
+            <w:tcW w:type="dxa" w:w="2800"/>
+            <w:tcBorders>
+              <w:top w:val="single" w:color="BFC8D9" w:sz="4"/>
+              <w:left w:val="single" w:color="BFC8D9" w:sz="4"/>
+              <w:bottom w:val="single" w:color="BFC8D9" w:sz="4"/>
+              <w:right w:val="single" w:color="BFC8D9" w:sz="4"/>
+            </w:tcBorders>
+            <w:shd w:fill="E8F1F8" w:color="auto" w:val="clear"/>
+            <w:tcMar>
+              <w:top w:type="dxa" w:w="70"/>
+              <w:left w:type="dxa" w:w="110"/>
+              <w:bottom w:type="dxa" w:w="70"/>
+              <w:right w:type="dxa" w:w="110"/>
+            </w:tcMar>
+          </w:tcPr>
+          <w:p>
+            <w:pPr>
+              <w:spacing w:after="40"/>
+            </w:pPr>
+            <w:r>
+              <w:rPr>
+                <w:b/>
+                <w:bCs/>
+              </w:rPr>
+              <w:t xml:space="preserve">Common base</w:t>
+            </w:r>
+          </w:p>
+        </w:tc>
+        <w:tc>
+          <w:tcPr>
+            <w:tcW w:type="dxa" w:w="6560"/>
+            <w:tcBorders>
+              <w:top w:val="single" w:color="BFC8D9" w:sz="4"/>
+              <w:left w:val="single" w:color="BFC8D9" w:sz="4"/>
+              <w:bottom w:val="single" w:color="BFC8D9" w:sz="4"/>
+              <w:right w:val="single" w:color="BFC8D9" w:sz="4"/>
+            </w:tcBorders>
+            <w:tcMar>
+              <w:top w:type="dxa" w:w="70"/>
+              <w:left w:type="dxa" w:w="110"/>
+              <w:bottom w:type="dxa" w:w="70"/>
+              <w:right w:type="dxa" w:w="110"/>
+            </w:tcMar>
+          </w:tcPr>
+          <w:p>
+            <w:pPr>
+              <w:spacing w:after="40"/>
+            </w:pPr>
+            <w:r>
+              <w:rPr>
+                <w:rFonts w:ascii="Consolas" w:cs="Consolas" w:eastAsia="Consolas" w:hAnsi="Consolas"/>
+                <w:color w:val="1F3864"/>
+                <w:sz w:val="19"/>
+                <w:szCs w:val="19"/>
+              </w:rPr>
+              <w:t xml:space="preserve">e1234c7</w:t>
+            </w:r>
+            <w:r>
+              <w:t xml:space="preserve"> (Nihal's previous tip, already in this branch)</w:t>
+            </w:r>
+          </w:p>
+        </w:tc>
+      </w:tr>
+      <w:tr>
+        <w:trPr>
+          <w:cantSplit/>
+          <w:tblHeader w:val="false"/>
+        </w:trPr>
+        <w:tc>
+          <w:tcPr>
+            <w:tcW w:type="dxa" w:w="2800"/>
+            <w:tcBorders>
+              <w:top w:val="single" w:color="BFC8D9" w:sz="4"/>
+              <w:left w:val="single" w:color="BFC8D9" w:sz="4"/>
+              <w:bottom w:val="single" w:color="BFC8D9" w:sz="4"/>
+              <w:right w:val="single" w:color="BFC8D9" w:sz="4"/>
+            </w:tcBorders>
+            <w:shd w:fill="E8F1F8" w:color="auto" w:val="clear"/>
+            <w:tcMar>
+              <w:top w:type="dxa" w:w="70"/>
+              <w:left w:type="dxa" w:w="110"/>
+              <w:bottom w:type="dxa" w:w="70"/>
+              <w:right w:type="dxa" w:w="110"/>
+            </w:tcMar>
+          </w:tcPr>
+          <w:p>
+            <w:pPr>
+              <w:spacing w:after="40"/>
+            </w:pPr>
+            <w:r>
+              <w:rPr>
+                <w:b/>
+                <w:bCs/>
+              </w:rPr>
+              <w:t xml:space="preserve">Merge commit</w:t>
+            </w:r>
+          </w:p>
+        </w:tc>
+        <w:tc>
+          <w:tcPr>
+            <w:tcW w:type="dxa" w:w="6560"/>
+            <w:tcBorders>
+              <w:top w:val="single" w:color="BFC8D9" w:sz="4"/>
+              <w:left w:val="single" w:color="BFC8D9" w:sz="4"/>
+              <w:bottom w:val="single" w:color="BFC8D9" w:sz="4"/>
+              <w:right w:val="single" w:color="BFC8D9" w:sz="4"/>
+            </w:tcBorders>
+            <w:tcMar>
+              <w:top w:type="dxa" w:w="70"/>
+              <w:left w:type="dxa" w:w="110"/>
+              <w:bottom w:type="dxa" w:w="70"/>
+              <w:right w:type="dxa" w:w="110"/>
+            </w:tcMar>
+          </w:tcPr>
+          <w:p>
+            <w:pPr>
+              <w:spacing w:after="40"/>
+            </w:pPr>
+            <w:r>
+              <w:rPr>
+                <w:rFonts w:ascii="Consolas" w:cs="Consolas" w:eastAsia="Consolas" w:hAnsi="Consolas"/>
+                <w:color w:val="1F3864"/>
+                <w:sz w:val="19"/>
+                <w:szCs w:val="19"/>
+              </w:rPr>
+              <w:t xml:space="preserve">663c567</w:t>
+            </w:r>
+          </w:p>
+        </w:tc>
+      </w:tr>
+    </w:tbl>
+    <w:p>
+      <w:pPr>
+        <w:spacing w:after="60"/>
+      </w:pPr>
+    </w:p>
+    <w:p>
+      <w:pPr>
+        <w:keepNext/>
+        <w:spacing w:after="40" w:before="120"/>
+      </w:pPr>
+      <w:r>
+        <w:rPr>
+          <w:b/>
+          <w:bCs/>
+          <w:color w:val="2E4A87"/>
+          <w:sz w:val="23"/>
+          <w:szCs w:val="23"/>
+        </w:rPr>
+        <w:t xml:space="preserve">Result</w:t>
+      </w:r>
+    </w:p>
+    <w:p>
+      <w:pPr>
+        <w:pStyle w:val="ListParagraph"/>
+        <w:numPr>
+          <w:ilvl w:val="0"/>
+          <w:numId w:val="2"/>
+        </w:numPr>
+        <w:spacing w:after="60"/>
+      </w:pPr>
+      <w:r>
+        <w:rPr>
+          <w:b/>
+          <w:bCs/>
+        </w:rPr>
+        <w:t xml:space="preserve">No merge conflicts.</w:t>
+      </w:r>
+      <w:r>
+        <w:t xml:space="preserve"> </w:t>
+      </w:r>
+      <w:r>
+        <w:rPr>
+          <w:rFonts w:ascii="Consolas" w:cs="Consolas" w:eastAsia="Consolas" w:hAnsi="Consolas"/>
+          <w:color w:val="1F3864"/>
+          <w:sz w:val="19"/>
+          <w:szCs w:val="19"/>
+        </w:rPr>
+        <w:t xml:space="preserve">ChatWindow.tsx</w:t>
+      </w:r>
+      <w:r>
+        <w:t xml:space="preserve"> was changed on both sides, but Nihal only added one line (</w:t>
+      </w:r>
+      <w:r>
+        <w:rPr>
+          <w:rFonts w:ascii="Consolas" w:cs="Consolas" w:eastAsia="Consolas" w:hAnsi="Consolas"/>
+          <w:color w:val="1F3864"/>
+          <w:sz w:val="19"/>
+          <w:szCs w:val="19"/>
+        </w:rPr>
+        <w:t xml:space="preserve">data-tour="stop-query"</w:t>
+      </w:r>
+      <w:r>
+        <w:t xml:space="preserve"> on the Stop button), away from our changes; git merged it automatically.</w:t>
+      </w:r>
+    </w:p>
+    <w:p>
+      <w:pPr>
+        <w:pStyle w:val="ListParagraph"/>
+        <w:numPr>
+          <w:ilvl w:val="0"/>
+          <w:numId w:val="2"/>
+        </w:numPr>
+        <w:spacing w:after="60"/>
+      </w:pPr>
+      <w:r>
+        <w:rPr>
+          <w:b/>
+          <w:bCs/>
+        </w:rPr>
+        <w:t xml:space="preserve">No logic conflicts.</w:t>
+      </w:r>
+      <w:r>
+        <w:t xml:space="preserve"> Every element the tour points at still exists; the chat still sends </w:t>
+      </w:r>
+      <w:r>
+        <w:rPr>
+          <w:rFonts w:ascii="Consolas" w:cs="Consolas" w:eastAsia="Consolas" w:hAnsi="Consolas"/>
+          <w:color w:val="1F3864"/>
+          <w:sz w:val="19"/>
+          <w:szCs w:val="19"/>
+        </w:rPr>
+        <w:t xml:space="preserve">tour-response-ready</w:t>
+      </w:r>
+      <w:r>
+        <w:t xml:space="preserve"> after the first answer; the admin-only profile rule uses the same </w:t>
+      </w:r>
+      <w:r>
+        <w:rPr>
+          <w:rFonts w:ascii="Consolas" w:cs="Consolas" w:eastAsia="Consolas" w:hAnsi="Consolas"/>
+          <w:color w:val="1F3864"/>
+          <w:sz w:val="19"/>
+          <w:szCs w:val="19"/>
+        </w:rPr>
+        <w:t xml:space="preserve">users/{uid}.role</w:t>
+      </w:r>
+      <w:r>
+        <w:t xml:space="preserve"> as </w:t>
+      </w:r>
+      <w:r>
+        <w:rPr>
+          <w:rFonts w:ascii="Consolas" w:cs="Consolas" w:eastAsia="Consolas" w:hAnsi="Consolas"/>
+          <w:color w:val="1F3864"/>
+          <w:sz w:val="19"/>
+          <w:szCs w:val="19"/>
+        </w:rPr>
+        <w:t xml:space="preserve">requireAdmin</w:t>
+      </w:r>
+      <w:r>
+        <w:t xml:space="preserve">.</w:t>
+      </w:r>
+    </w:p>
+    <w:p>
+      <w:pPr>
+        <w:keepNext/>
+        <w:spacing w:after="40" w:before="120"/>
+      </w:pPr>
+      <w:r>
+        <w:rPr>
+          <w:b/>
+          <w:bCs/>
+          <w:color w:val="2E4A87"/>
+          <w:sz w:val="23"/>
+          <w:szCs w:val="23"/>
+        </w:rPr>
+        <w:t xml:space="preserve">Brought in</w:t>
+      </w:r>
+    </w:p>
+    <w:p>
+      <w:pPr>
+        <w:pStyle w:val="ListParagraph"/>
+        <w:numPr>
+          <w:ilvl w:val="0"/>
+          <w:numId w:val="2"/>
+        </w:numPr>
+        <w:spacing w:after="60"/>
+      </w:pPr>
+      <w:r>
+        <w:t xml:space="preserve">Assistant tour now covers the conversation dropdown, New chat and Stop (</w:t>
+      </w:r>
+      <w:r>
+        <w:rPr>
+          <w:rFonts w:ascii="Consolas" w:cs="Consolas" w:eastAsia="Consolas" w:hAnsi="Consolas"/>
+          <w:color w:val="1F3864"/>
+          <w:sz w:val="19"/>
+          <w:szCs w:val="19"/>
+        </w:rPr>
+        <w:t xml:space="preserve">AppTour.tsx</w:t>
+      </w:r>
+      <w:r>
+        <w:t xml:space="preserve">, </w:t>
+      </w:r>
+      <w:r>
+        <w:rPr>
+          <w:rFonts w:ascii="Consolas" w:cs="Consolas" w:eastAsia="Consolas" w:hAnsi="Consolas"/>
+          <w:color w:val="1F3864"/>
+          <w:sz w:val="19"/>
+          <w:szCs w:val="19"/>
+        </w:rPr>
+        <w:t xml:space="preserve">ConversationPicker.tsx</w:t>
+      </w:r>
+      <w:r>
+        <w:t xml:space="preserve">).</w:t>
+      </w:r>
+    </w:p>
+    <w:p>
+      <w:pPr>
+        <w:pStyle w:val="ListParagraph"/>
+        <w:numPr>
+          <w:ilvl w:val="0"/>
+          <w:numId w:val="2"/>
+        </w:numPr>
+        <w:spacing w:after="60"/>
+      </w:pPr>
+      <w:r>
+        <w:t xml:space="preserve">Sign-out asks for confirmation; a profile icon for employees, hidden for admins (</w:t>
+      </w:r>
+      <w:r>
+        <w:rPr>
+          <w:rFonts w:ascii="Consolas" w:cs="Consolas" w:eastAsia="Consolas" w:hAnsi="Consolas"/>
+          <w:color w:val="1F3864"/>
+          <w:sz w:val="19"/>
+          <w:szCs w:val="19"/>
+        </w:rPr>
+        <w:t xml:space="preserve">Navbar.tsx</w:t>
+      </w:r>
+      <w:r>
+        <w:t xml:space="preserve">).</w:t>
+      </w:r>
+    </w:p>
+    <w:p>
+      <w:pPr>
+        <w:pStyle w:val="ListParagraph"/>
+        <w:numPr>
+          <w:ilvl w:val="0"/>
+          <w:numId w:val="2"/>
+        </w:numPr>
+        <w:spacing w:after="60"/>
+      </w:pPr>
+      <w:r>
+        <w:t xml:space="preserve">Clearer tour replay menu (</w:t>
+      </w:r>
+      <w:r>
+        <w:rPr>
+          <w:rFonts w:ascii="Consolas" w:cs="Consolas" w:eastAsia="Consolas" w:hAnsi="Consolas"/>
+          <w:color w:val="1F3864"/>
+          <w:sz w:val="19"/>
+          <w:szCs w:val="19"/>
+        </w:rPr>
+        <w:t xml:space="preserve">HelpMenu.tsx</w:t>
+      </w:r>
+      <w:r>
+        <w:t xml:space="preserve">).</w:t>
+      </w:r>
+    </w:p>
+    <w:p>
+      <w:pPr>
+        <w:keepNext/>
+        <w:spacing w:after="40" w:before="120"/>
+      </w:pPr>
+      <w:r>
+        <w:rPr>
+          <w:b/>
+          <w:bCs/>
+          <w:color w:val="2E4A87"/>
+          <w:sz w:val="23"/>
+          <w:szCs w:val="23"/>
+        </w:rPr>
+        <w:t xml:space="preserve">Good to know</w:t>
+      </w:r>
+    </w:p>
+    <w:p>
+      <w:pPr>
+        <w:pStyle w:val="ListParagraph"/>
+        <w:numPr>
+          <w:ilvl w:val="0"/>
+          <w:numId w:val="2"/>
+        </w:numPr>
+        <w:spacing w:after="60"/>
+      </w:pPr>
+      <w:r>
+        <w:rPr>
+          <w:b/>
+          <w:bCs/>
+        </w:rPr>
+        <w:t xml:space="preserve">Help and the tour are for employees only.</w:t>
+      </w:r>
+      <w:r>
+        <w:t xml:space="preserve"> "Help ▾" is on Home and Profile. Admins have no Help menu or tour, and the Admin sidebar has no Home link. This wasn't designed yet; it is not caused by the merge.</w:t>
+      </w:r>
+    </w:p>
+    <w:p>
+      <w:pPr>
+        <w:pStyle w:val="ListParagraph"/>
+        <w:numPr>
+          <w:ilvl w:val="0"/>
+          <w:numId w:val="2"/>
+        </w:numPr>
+        <w:spacing w:after="60"/>
+      </w:pPr>
+      <w:r>
+        <w:rPr>
+          <w:rFonts w:ascii="Consolas" w:cs="Consolas" w:eastAsia="Consolas" w:hAnsi="Consolas"/>
+          <w:color w:val="1F3864"/>
+          <w:sz w:val="19"/>
+          <w:szCs w:val="19"/>
+        </w:rPr>
+        <w:t xml:space="preserve">data-tour="stop-query"</w:t>
+      </w:r>
+      <w:r>
+        <w:t xml:space="preserve"> is not used by the tour yet (Stop only shows while an answer is loading).</w:t>
+      </w:r>
+    </w:p>
+    <w:p>
+      <w:pPr>
+        <w:keepNext/>
+        <w:spacing w:after="40" w:before="120"/>
+      </w:pPr>
+      <w:r>
+        <w:rPr>
+          <w:b/>
+          <w:bCs/>
+          <w:color w:val="2E4A87"/>
+          <w:sz w:val="23"/>
+          <w:szCs w:val="23"/>
+        </w:rPr>
+        <w:t xml:space="preserve">Check</w:t>
+      </w:r>
+    </w:p>
+    <w:tbl>
+      <w:tblPr>
+        <w:tblW w:type="dxa" w:w="9360"/>
+        <w:tblBorders>
+          <w:top w:val="single" w:color="auto" w:sz="4"/>
+          <w:left w:val="single" w:color="auto" w:sz="4"/>
+          <w:bottom w:val="single" w:color="auto" w:sz="4"/>
+          <w:right w:val="single" w:color="auto" w:sz="4"/>
+          <w:insideH w:val="single" w:color="auto" w:sz="4"/>
+          <w:insideV w:val="single" w:color="auto" w:sz="4"/>
+        </w:tblBorders>
+      </w:tblPr>
+      <w:tblGrid>
+        <w:gridCol w:w="4300"/>
+        <w:gridCol w:w="5060"/>
+      </w:tblGrid>
+      <w:tr>
+        <w:trPr>
+          <w:cantSplit/>
+          <w:tblHeader/>
+        </w:trPr>
+        <w:tc>
+          <w:tcPr>
+            <w:tcW w:type="dxa" w:w="4300"/>
+            <w:tcBorders>
+              <w:top w:val="single" w:color="BFC8D9" w:sz="4"/>
+              <w:left w:val="single" w:color="BFC8D9" w:sz="4"/>
+              <w:bottom w:val="single" w:color="BFC8D9" w:sz="4"/>
+              <w:right w:val="single" w:color="BFC8D9" w:sz="4"/>
+            </w:tcBorders>
+            <w:shd w:fill="4361AB" w:color="auto" w:val="clear"/>
+            <w:tcMar>
+              <w:top w:type="dxa" w:w="70"/>
+              <w:left w:type="dxa" w:w="110"/>
+              <w:bottom w:type="dxa" w:w="70"/>
+              <w:right w:type="dxa" w:w="110"/>
+            </w:tcMar>
+          </w:tcPr>
+          <w:p>
+            <w:pPr>
+              <w:spacing w:after="40"/>
+            </w:pPr>
+            <w:r>
+              <w:rPr>
+                <w:b/>
+                <w:bCs/>
+                <w:color w:val="FFFFFF"/>
+              </w:rPr>
+              <w:t xml:space="preserve">Check</w:t>
+            </w:r>
+          </w:p>
+        </w:tc>
+        <w:tc>
+          <w:tcPr>
+            <w:tcW w:type="dxa" w:w="5060"/>
+            <w:tcBorders>
+              <w:top w:val="single" w:color="BFC8D9" w:sz="4"/>
+              <w:left w:val="single" w:color="BFC8D9" w:sz="4"/>
+              <w:bottom w:val="single" w:color="BFC8D9" w:sz="4"/>
+              <w:right w:val="single" w:color="BFC8D9" w:sz="4"/>
+            </w:tcBorders>
+            <w:shd w:fill="4361AB" w:color="auto" w:val="clear"/>
+            <w:tcMar>
+              <w:top w:type="dxa" w:w="70"/>
+              <w:left w:type="dxa" w:w="110"/>
+              <w:bottom w:type="dxa" w:w="70"/>
+              <w:right w:type="dxa" w:w="110"/>
+            </w:tcMar>
+          </w:tcPr>
+          <w:p>
+            <w:pPr>
+              <w:spacing w:after="40"/>
+            </w:pPr>
+            <w:r>
+              <w:rPr>
+                <w:b/>
+                <w:bCs/>
+                <w:color w:val="FFFFFF"/>
+              </w:rPr>
+              <w:t xml:space="preserve">Expect</w:t>
+            </w:r>
+          </w:p>
+        </w:tc>
+      </w:tr>
+      <w:tr>
+        <w:trPr>
+          <w:cantSplit/>
+          <w:tblHeader w:val="false"/>
+        </w:trPr>
+        <w:tc>
+          <w:tcPr>
+            <w:tcW w:type="dxa" w:w="4300"/>
+            <w:tcBorders>
+              <w:top w:val="single" w:color="BFC8D9" w:sz="4"/>
+              <w:left w:val="single" w:color="BFC8D9" w:sz="4"/>
+              <w:bottom w:val="single" w:color="BFC8D9" w:sz="4"/>
+              <w:right w:val="single" w:color="BFC8D9" w:sz="4"/>
+            </w:tcBorders>
+            <w:tcMar>
+              <w:top w:type="dxa" w:w="70"/>
+              <w:left w:type="dxa" w:w="110"/>
+              <w:bottom w:type="dxa" w:w="70"/>
+              <w:right w:type="dxa" w:w="110"/>
+            </w:tcMar>
+          </w:tcPr>
+          <w:p>
+            <w:pPr>
+              <w:spacing w:after="40"/>
+            </w:pPr>
+            <w:r>
+              <w:t xml:space="preserve">Sign in as Alex → Home → Help ▾ → AI Assistant</w:t>
+            </w:r>
+          </w:p>
+        </w:tc>
+        <w:tc>
+          <w:tcPr>
+            <w:tcW w:type="dxa" w:w="5060"/>
+            <w:tcBorders>
+              <w:top w:val="single" w:color="BFC8D9" w:sz="4"/>
+              <w:left w:val="single" w:color="BFC8D9" w:sz="4"/>
+              <w:bottom w:val="single" w:color="BFC8D9" w:sz="4"/>
+              <w:right w:val="single" w:color="BFC8D9" w:sz="4"/>
+            </w:tcBorders>
+            <w:tcMar>
+              <w:top w:type="dxa" w:w="70"/>
+              <w:left w:type="dxa" w:w="110"/>
+              <w:bottom w:type="dxa" w:w="70"/>
+              <w:right w:type="dxa" w:w="110"/>
+            </w:tcMar>
+          </w:tcPr>
+          <w:p>
+            <w:pPr>
+              <w:spacing w:after="40"/>
+            </w:pPr>
+            <w:r>
+              <w:t xml:space="preserve">Tour steps through the conversation dropdown, New chat and the chat box</w:t>
+            </w:r>
+          </w:p>
+        </w:tc>
+      </w:tr>
+      <w:tr>
+        <w:trPr>
+          <w:cantSplit/>
+          <w:tblHeader w:val="false"/>
+        </w:trPr>
+        <w:tc>
+          <w:tcPr>
+            <w:tcW w:type="dxa" w:w="4300"/>
+            <w:tcBorders>
+              <w:top w:val="single" w:color="BFC8D9" w:sz="4"/>
+              <w:left w:val="single" w:color="BFC8D9" w:sz="4"/>
+              <w:bottom w:val="single" w:color="BFC8D9" w:sz="4"/>
+              <w:right w:val="single" w:color="BFC8D9" w:sz="4"/>
+            </w:tcBorders>
+            <w:tcMar>
+              <w:top w:type="dxa" w:w="70"/>
+              <w:left w:type="dxa" w:w="110"/>
+              <w:bottom w:type="dxa" w:w="70"/>
+              <w:right w:type="dxa" w:w="110"/>
+            </w:tcMar>
+          </w:tcPr>
+          <w:p>
+            <w:pPr>
+              <w:spacing w:after="40"/>
+            </w:pPr>
+            <w:r>
+              <w:t xml:space="preserve">Sign out</w:t>
+            </w:r>
+          </w:p>
+        </w:tc>
+        <w:tc>
+          <w:tcPr>
+            <w:tcW w:type="dxa" w:w="5060"/>
+            <w:tcBorders>
+              <w:top w:val="single" w:color="BFC8D9" w:sz="4"/>
+              <w:left w:val="single" w:color="BFC8D9" w:sz="4"/>
+              <w:bottom w:val="single" w:color="BFC8D9" w:sz="4"/>
+              <w:right w:val="single" w:color="BFC8D9" w:sz="4"/>
+            </w:tcBorders>
+            <w:tcMar>
+              <w:top w:type="dxa" w:w="70"/>
+              <w:left w:type="dxa" w:w="110"/>
+              <w:bottom w:type="dxa" w:w="70"/>
+              <w:right w:type="dxa" w:w="110"/>
+            </w:tcMar>
+          </w:tcPr>
+          <w:p>
+            <w:pPr>
+              <w:spacing w:after="40"/>
+            </w:pPr>
+            <w:r>
+              <w:t xml:space="preserve">Asks for confirmation first</w:t>
+            </w:r>
+          </w:p>
+        </w:tc>
+      </w:tr>
+      <w:tr>
+        <w:trPr>
+          <w:cantSplit/>
+          <w:tblHeader w:val="false"/>
+        </w:trPr>
+        <w:tc>
+          <w:tcPr>
+            <w:tcW w:type="dxa" w:w="4300"/>
+            <w:tcBorders>
+              <w:top w:val="single" w:color="BFC8D9" w:sz="4"/>
+              <w:left w:val="single" w:color="BFC8D9" w:sz="4"/>
+              <w:bottom w:val="single" w:color="BFC8D9" w:sz="4"/>
+              <w:right w:val="single" w:color="BFC8D9" w:sz="4"/>
+            </w:tcBorders>
+            <w:tcMar>
+              <w:top w:type="dxa" w:w="70"/>
+              <w:left w:type="dxa" w:w="110"/>
+              <w:bottom w:type="dxa" w:w="70"/>
+              <w:right w:type="dxa" w:w="110"/>
+            </w:tcMar>
+          </w:tcPr>
+          <w:p>
+            <w:pPr>
+              <w:spacing w:after="40"/>
+            </w:pPr>
+            <w:r>
+              <w:t xml:space="preserve">Sign in as the admin</w:t>
+            </w:r>
+          </w:p>
+        </w:tc>
+        <w:tc>
+          <w:tcPr>
+            <w:tcW w:type="dxa" w:w="5060"/>
+            <w:tcBorders>
+              <w:top w:val="single" w:color="BFC8D9" w:sz="4"/>
+              <w:left w:val="single" w:color="BFC8D9" w:sz="4"/>
+              <w:bottom w:val="single" w:color="BFC8D9" w:sz="4"/>
+              <w:right w:val="single" w:color="BFC8D9" w:sz="4"/>
+            </w:tcBorders>
+            <w:tcMar>
+              <w:top w:type="dxa" w:w="70"/>
+              <w:left w:type="dxa" w:w="110"/>
+              <w:bottom w:type="dxa" w:w="70"/>
+              <w:right w:type="dxa" w:w="110"/>
+            </w:tcMar>
+          </w:tcPr>
+          <w:p>
+            <w:pPr>
+              <w:spacing w:after="40"/>
+            </w:pPr>
+            <w:r>
+              <w:t xml:space="preserve">No profile icon; Admin pages work as before</w:t>
+            </w:r>
+          </w:p>
+        </w:tc>
+      </w:tr>
+      <w:tr>
+        <w:trPr>
+          <w:cantSplit/>
+          <w:tblHeader w:val="false"/>
+        </w:trPr>
+        <w:tc>
+          <w:tcPr>
+            <w:tcW w:type="dxa" w:w="4300"/>
+            <w:tcBorders>
+              <w:top w:val="single" w:color="BFC8D9" w:sz="4"/>
+              <w:left w:val="single" w:color="BFC8D9" w:sz="4"/>
+              <w:bottom w:val="single" w:color="BFC8D9" w:sz="4"/>
+              <w:right w:val="single" w:color="BFC8D9" w:sz="4"/>
+            </w:tcBorders>
+            <w:tcMar>
+              <w:top w:type="dxa" w:w="70"/>
+              <w:left w:type="dxa" w:w="110"/>
+              <w:bottom w:type="dxa" w:w="70"/>
+              <w:right w:type="dxa" w:w="110"/>
+            </w:tcMar>
+          </w:tcPr>
+          <w:p>
+            <w:pPr>
+              <w:spacing w:after="40"/>
+            </w:pPr>
+            <w:r>
+              <w:rPr>
+                <w:rFonts w:ascii="Consolas" w:cs="Consolas" w:eastAsia="Consolas" w:hAnsi="Consolas"/>
+                <w:color w:val="1F3864"/>
+                <w:sz w:val="19"/>
+                <w:szCs w:val="19"/>
+              </w:rPr>
+              <w:t xml:space="preserve">pnpm --filter frontend test</w:t>
+            </w:r>
+            <w:r>
+              <w:t xml:space="preserve"> and </w:t>
+            </w:r>
+            <w:r>
+              <w:rPr>
+                <w:rFonts w:ascii="Consolas" w:cs="Consolas" w:eastAsia="Consolas" w:hAnsi="Consolas"/>
+                <w:color w:val="1F3864"/>
+                <w:sz w:val="19"/>
+                <w:szCs w:val="19"/>
+              </w:rPr>
+              <w:t xml:space="preserve">typecheck</w:t>
+            </w:r>
+          </w:p>
+        </w:tc>
+        <w:tc>
+          <w:tcPr>
+            <w:tcW w:type="dxa" w:w="5060"/>
+            <w:tcBorders>
+              <w:top w:val="single" w:color="BFC8D9" w:sz="4"/>
+              <w:left w:val="single" w:color="BFC8D9" w:sz="4"/>
+              <w:bottom w:val="single" w:color="BFC8D9" w:sz="4"/>
+              <w:right w:val="single" w:color="BFC8D9" w:sz="4"/>
+            </w:tcBorders>
+            <w:tcMar>
+              <w:top w:type="dxa" w:w="70"/>
+              <w:left w:type="dxa" w:w="110"/>
+              <w:bottom w:type="dxa" w:w="70"/>
+              <w:right w:type="dxa" w:w="110"/>
+            </w:tcMar>
+          </w:tcPr>
+          <w:p>
+            <w:pPr>
+              <w:spacing w:after="40"/>
+            </w:pPr>
+            <w:r>
+              <w:t xml:space="preserve">All pass</w:t>
+            </w:r>
+          </w:p>
+        </w:tc>
+      </w:tr>
+    </w:tbl>
+    <w:p>
+      <w:pPr>
+        <w:spacing w:after="60"/>
+      </w:pPr>
     </w:p>
     <w:sectPr>
       <w:pgSz w:w="11906" w:h="16838" w:orient="portrait"/>

</xml_diff>